<commit_message>
Developer guide: explain the two workflow files (step A0)
Adds step A0: the caller SDLC-Harness.yml lives on the service repo's
default and release branches and is maintained by DevOps; the engine's
harness.yml lives only in the engine repo and is fetched at v1. Includes
how to check the caller is present. Table rows no longer split across
pages in either guide.

Co-Authored-By: Claude Opus 5.5 <noreply@anthropic.com>
Claude-Session: https://claude.ai/code/session_013bELyoNPPr1pVLZG4rTVUY
</commit_message>
<xml_diff>
--- a/docs/SDLC-Harness_Admin_DevOps_Setup_Guide.docx
+++ b/docs/SDLC-Harness_Admin_DevOps_Setup_Guide.docx
@@ -208,6 +208,9 @@
         </w:tc>
       </w:tr>
       <w:tr>
+        <w:trPr>
+          <w:cantSplit/>
+        </w:trPr>
         <w:tc>
           <w:tcPr>
             <w:tcW w:type="dxa" w:w="600"/>
@@ -298,6 +301,9 @@
         </w:tc>
       </w:tr>
       <w:tr>
+        <w:trPr>
+          <w:cantSplit/>
+        </w:trPr>
         <w:tc>
           <w:tcPr>
             <w:tcW w:type="dxa" w:w="600"/>
@@ -388,6 +394,9 @@
         </w:tc>
       </w:tr>
       <w:tr>
+        <w:trPr>
+          <w:cantSplit/>
+        </w:trPr>
         <w:tc>
           <w:tcPr>
             <w:tcW w:type="dxa" w:w="600"/>
@@ -489,6 +498,9 @@
         </w:tc>
       </w:tr>
       <w:tr>
+        <w:trPr>
+          <w:cantSplit/>
+        </w:trPr>
         <w:tc>
           <w:tcPr>
             <w:tcW w:type="dxa" w:w="600"/>
@@ -579,6 +591,9 @@
         </w:tc>
       </w:tr>
       <w:tr>
+        <w:trPr>
+          <w:cantSplit/>
+        </w:trPr>
         <w:tc>
           <w:tcPr>
             <w:tcW w:type="dxa" w:w="600"/>
@@ -669,6 +684,9 @@
         </w:tc>
       </w:tr>
       <w:tr>
+        <w:trPr>
+          <w:cantSplit/>
+        </w:trPr>
         <w:tc>
           <w:tcPr>
             <w:tcW w:type="dxa" w:w="600"/>
@@ -759,6 +777,9 @@
         </w:tc>
       </w:tr>
       <w:tr>
+        <w:trPr>
+          <w:cantSplit/>
+        </w:trPr>
         <w:tc>
           <w:tcPr>
             <w:tcW w:type="dxa" w:w="600"/>
@@ -1002,6 +1023,9 @@
         </w:tc>
       </w:tr>
       <w:tr>
+        <w:trPr>
+          <w:cantSplit/>
+        </w:trPr>
         <w:tc>
           <w:tcPr>
             <w:tcW w:type="dxa" w:w="2300"/>
@@ -1092,6 +1116,9 @@
         </w:tc>
       </w:tr>
       <w:tr>
+        <w:trPr>
+          <w:cantSplit/>
+        </w:trPr>
         <w:tc>
           <w:tcPr>
             <w:tcW w:type="dxa" w:w="2300"/>
@@ -1204,6 +1231,9 @@
         </w:tc>
       </w:tr>
       <w:tr>
+        <w:trPr>
+          <w:cantSplit/>
+        </w:trPr>
         <w:tc>
           <w:tcPr>
             <w:tcW w:type="dxa" w:w="2300"/>
@@ -1562,6 +1592,9 @@
         </w:tc>
       </w:tr>
       <w:tr>
+        <w:trPr>
+          <w:cantSplit/>
+        </w:trPr>
         <w:tc>
           <w:tcPr>
             <w:tcW w:type="dxa" w:w="2600"/>
@@ -1608,6 +1641,9 @@
         </w:tc>
       </w:tr>
       <w:tr>
+        <w:trPr>
+          <w:cantSplit/>
+        </w:trPr>
         <w:tc>
           <w:tcPr>
             <w:tcW w:type="dxa" w:w="2600"/>
@@ -1662,6 +1698,9 @@
         </w:tc>
       </w:tr>
       <w:tr>
+        <w:trPr>
+          <w:cantSplit/>
+        </w:trPr>
         <w:tc>
           <w:tcPr>
             <w:tcW w:type="dxa" w:w="2600"/>
@@ -1728,6 +1767,9 @@
         </w:tc>
       </w:tr>
       <w:tr>
+        <w:trPr>
+          <w:cantSplit/>
+        </w:trPr>
         <w:tc>
           <w:tcPr>
             <w:tcW w:type="dxa" w:w="2600"/>
@@ -1774,6 +1816,9 @@
         </w:tc>
       </w:tr>
       <w:tr>
+        <w:trPr>
+          <w:cantSplit/>
+        </w:trPr>
         <w:tc>
           <w:tcPr>
             <w:tcW w:type="dxa" w:w="2600"/>
@@ -1831,6 +1876,9 @@
         </w:tc>
       </w:tr>
       <w:tr>
+        <w:trPr>
+          <w:cantSplit/>
+        </w:trPr>
         <w:tc>
           <w:tcPr>
             <w:tcW w:type="dxa" w:w="2600"/>
@@ -1979,6 +2027,9 @@
         </w:tc>
       </w:tr>
       <w:tr>
+        <w:trPr>
+          <w:cantSplit/>
+        </w:trPr>
         <w:tc>
           <w:tcPr>
             <w:tcW w:type="dxa" w:w="2600"/>
@@ -2025,6 +2076,9 @@
         </w:tc>
       </w:tr>
       <w:tr>
+        <w:trPr>
+          <w:cantSplit/>
+        </w:trPr>
         <w:tc>
           <w:tcPr>
             <w:tcW w:type="dxa" w:w="2600"/>
@@ -2104,6 +2158,9 @@
         </w:tc>
       </w:tr>
       <w:tr>
+        <w:trPr>
+          <w:cantSplit/>
+        </w:trPr>
         <w:tc>
           <w:tcPr>
             <w:tcW w:type="dxa" w:w="2600"/>
@@ -2158,6 +2215,9 @@
         </w:tc>
       </w:tr>
       <w:tr>
+        <w:trPr>
+          <w:cantSplit/>
+        </w:trPr>
         <w:tc>
           <w:tcPr>
             <w:tcW w:type="dxa" w:w="2600"/>
@@ -2462,6 +2522,9 @@
         </w:tc>
       </w:tr>
       <w:tr>
+        <w:trPr>
+          <w:cantSplit/>
+        </w:trPr>
         <w:tc>
           <w:tcPr>
             <w:tcW w:type="dxa" w:w="2600"/>
@@ -2543,6 +2606,9 @@
         </w:tc>
       </w:tr>
       <w:tr>
+        <w:trPr>
+          <w:cantSplit/>
+        </w:trPr>
         <w:tc>
           <w:tcPr>
             <w:tcW w:type="dxa" w:w="2600"/>
@@ -2599,6 +2665,9 @@
         </w:tc>
       </w:tr>
       <w:tr>
+        <w:trPr>
+          <w:cantSplit/>
+        </w:trPr>
         <w:tc>
           <w:tcPr>
             <w:tcW w:type="dxa" w:w="2600"/>
@@ -2672,6 +2741,9 @@
         </w:tc>
       </w:tr>
       <w:tr>
+        <w:trPr>
+          <w:cantSplit/>
+        </w:trPr>
         <w:tc>
           <w:tcPr>
             <w:tcW w:type="dxa" w:w="2600"/>
@@ -2723,6 +2795,9 @@
         </w:tc>
       </w:tr>
       <w:tr>
+        <w:trPr>
+          <w:cantSplit/>
+        </w:trPr>
         <w:tc>
           <w:tcPr>
             <w:tcW w:type="dxa" w:w="2600"/>
@@ -2782,6 +2857,9 @@
         </w:tc>
       </w:tr>
       <w:tr>
+        <w:trPr>
+          <w:cantSplit/>
+        </w:trPr>
         <w:tc>
           <w:tcPr>
             <w:tcW w:type="dxa" w:w="2600"/>
@@ -2841,6 +2919,9 @@
         </w:tc>
       </w:tr>
       <w:tr>
+        <w:trPr>
+          <w:cantSplit/>
+        </w:trPr>
         <w:tc>
           <w:tcPr>
             <w:tcW w:type="dxa" w:w="2600"/>
@@ -2928,6 +3009,9 @@
         </w:tc>
       </w:tr>
       <w:tr>
+        <w:trPr>
+          <w:cantSplit/>
+        </w:trPr>
         <w:tc>
           <w:tcPr>
             <w:tcW w:type="dxa" w:w="2600"/>
@@ -3119,6 +3203,9 @@
         </w:tc>
       </w:tr>
       <w:tr>
+        <w:trPr>
+          <w:cantSplit/>
+        </w:trPr>
         <w:tc>
           <w:tcPr>
             <w:tcW w:type="dxa" w:w="3000"/>
@@ -3176,6 +3263,9 @@
         </w:tc>
       </w:tr>
       <w:tr>
+        <w:trPr>
+          <w:cantSplit/>
+        </w:trPr>
         <w:tc>
           <w:tcPr>
             <w:tcW w:type="dxa" w:w="3000"/>
@@ -3233,6 +3323,9 @@
         </w:tc>
       </w:tr>
       <w:tr>
+        <w:trPr>
+          <w:cantSplit/>
+        </w:trPr>
         <w:tc>
           <w:tcPr>
             <w:tcW w:type="dxa" w:w="3000"/>
@@ -3279,6 +3372,9 @@
         </w:tc>
       </w:tr>
       <w:tr>
+        <w:trPr>
+          <w:cantSplit/>
+        </w:trPr>
         <w:tc>
           <w:tcPr>
             <w:tcW w:type="dxa" w:w="3000"/>
@@ -3347,6 +3443,9 @@
         </w:tc>
       </w:tr>
       <w:tr>
+        <w:trPr>
+          <w:cantSplit/>
+        </w:trPr>
         <w:tc>
           <w:tcPr>
             <w:tcW w:type="dxa" w:w="3000"/>

</xml_diff>